<commit_message>
fix(evidencia): resincronizar el articulo con resultados.json regenerado
Al regenerar resultados.json (por el cambio de R de los LEDs) salio a la luz que el
json commiteado llevaba DESACTUALIZADO desde la tanda de modos/audio: el jugador
simulado cambio de comportamiento (semilla por partida, pausas de Memoria) y nadie
volvio a correr experimentos.py. Verificado valor por valor contra el articulo:

- La afirmacion central SIGUE SIENDO CIERTA: 11/11 puntos del Monte Carlo dentro del
  IC 95 %, antes y despues. La tabla de Velocidad y Equilibrio no se movio.
- Desincronizada UNA fila (Memoria, L=6): el articulo citaba 520 rondas / 0,385, el
  json da 519 / 0,383. Corregida a la cifra medida.
- Precision: la frase sobre el limite del ULN decia "un orden de magnitud"; son ~50x
  (10,1 mA frente a 500 mA/canal del datasheet). El limite TOTAL del paquete es
  DESCONOCIDO (no esta tabulado), asi que no se cita.

Co-Authored-By: Claude Opus 4.8 (1M context) <noreply@anthropic.com>
</commit_message>
<xml_diff>
--- a/docs/articulo/Articulo_Tapete_Interactivo.docx
+++ b/docs/articulo/Articulo_Tapete_Interactivo.docx
@@ -6643,19 +6643,19 @@
               <w:jc w:val="right"/>
             </w:pPr>
             <w:r>
-              <w:t xml:space="preserve">520</w:t>
-            </w:r>
-          </w:p>
-        </w:tc>
-        <w:tc>
-          <w:tcPr/>
-          <w:p>
-            <w:pPr>
-              <w:pStyle w:val="Compact"/>
-              <w:jc w:val="right"/>
-            </w:pPr>
-            <w:r>
-              <w:t xml:space="preserve">0,385</w:t>
+              <w:t xml:space="preserve">519</w:t>
+            </w:r>
+          </w:p>
+        </w:tc>
+        <w:tc>
+          <w:tcPr/>
+          <w:p>
+            <w:pPr>
+              <w:pStyle w:val="Compact"/>
+              <w:jc w:val="right"/>
+            </w:pPr>
+            <w:r>
+              <w:t xml:space="preserve">0,383</w:t>
             </w:r>
           </w:p>
         </w:tc>
@@ -7163,7 +7163,7 @@
         <w:pStyle w:val="BodyText"/>
       </w:pPr>
       <w:r>
-        <w:t xml:space="preserve">Sobre la etapa de actuación, la misma simulación estima una corriente de 10,1 mA por grupo de tres diodos, unos 3,4 mA por diodo, con la resistencia de 110 Ω que fija la corriente de cada grupo. Esta cifra debe leerse con más cautela que la anterior: a diferencia del divisor, que es puramente resistivo, el modelo del diodo y la tensión de saturación del transistor Darlington son valores asumidos, no medidos. Se reporta como estimación de orden de magnitud, pendiente de confirmación con multímetro sobre el circuito armado. El valor inicial fue de 2,2 kΩ, tomado del inventario disponible, con el que cada diodo recibía unos 192 µA y la iluminación resultaba demasiado débil; la sustitución por 110 Ω multiplica la corriente por un factor cercano a veinte y mantiene el consumo del conjunto de seis grupos en unos 61 mA, un orden de magnitud por debajo del límite del arreglo Darlington.</w:t>
+        <w:t xml:space="preserve">Sobre la etapa de actuación, la misma simulación estima una corriente de 10,1 mA por grupo de tres diodos, unos 3,4 mA por diodo, con la resistencia de 110 Ω que fija la corriente de cada grupo. Esta cifra debe leerse con más cautela que la anterior: a diferencia del divisor, que es puramente resistivo, el modelo del diodo y la tensión de saturación del transistor Darlington son valores asumidos, no medidos. Se reporta como estimación de orden de magnitud, pendiente de confirmación con multímetro sobre el circuito armado. El valor inicial fue de 2,2 kΩ, tomado del inventario disponible, con el que cada diodo recibía unos 192 µA y la iluminación resultaba demasiado débil; la sustitución por 110 Ω multiplica la corriente por un factor cercano a veinte y mantiene el consumo del conjunto de seis grupos en unos 61 mA; cada canal del arreglo Darlington conduce así 10,1 mA, muy por debajo de los 500 mA que su hoja de datos declara como máximo por canal.</w:t>
       </w:r>
     </w:p>
     <w:bookmarkEnd w:id="74"/>

</xml_diff>